<commit_message>
Microbiome Methods iteration 1 finished, related to #13
</commit_message>
<xml_diff>
--- a/Microbiome Methods.docx
+++ b/Microbiome Methods.docx
@@ -36,16 +36,239 @@
       </w:r>
       <w:proofErr w:type="spellEnd"/>
       <w:r>
-        <w:t xml:space="preserve"> Pro kit following the manufacturer</w:t>
+        <w:t xml:space="preserve"> Pro kit</w:t>
+      </w:r>
+      <w:r>
+        <w:t xml:space="preserve"> (# </w:t>
+      </w:r>
+      <w:r>
+        <w:rPr>
+          <w:rFonts w:hint="cs"/>
+        </w:rPr>
+        <w:t>51804</w:t>
+      </w:r>
+      <w:r>
+        <w:t>)</w:t>
+      </w:r>
+      <w:r>
+        <w:t xml:space="preserve"> following the manufacturer</w:t>
       </w:r>
       <w:r>
         <w:t xml:space="preserve">’s </w:t>
       </w:r>
       <w:r>
-        <w:t>protocol.</w:t>
+        <w:t>instructions</w:t>
+      </w:r>
+      <w:r>
+        <w:t>.</w:t>
       </w:r>
       <w:r>
         <w:t xml:space="preserve"> </w:t>
+      </w:r>
+      <w:r>
+        <w:rPr>
+          <w:highlight w:val="yellow"/>
+        </w:rPr>
+        <w:t>ANA:</w:t>
+      </w:r>
+      <w:r>
+        <w:t xml:space="preserve"> </w:t>
+      </w:r>
+      <w:r>
+        <w:rPr>
+          <w:highlight w:val="yellow"/>
+        </w:rPr>
+        <w:t>Some information here would be good</w:t>
+      </w:r>
+      <w:r>
+        <w:rPr>
+          <w:highlight w:val="yellow"/>
+        </w:rPr>
+        <w:t>. Any change to the protocol? Did you use humans or robots in any of the steps</w:t>
+      </w:r>
+      <w:r>
+        <w:t>?</w:t>
+      </w:r>
+      <w:r>
+        <w:t xml:space="preserve"> Each DNA aliquot was stored in a </w:t>
+      </w:r>
+      <w:commentRangeStart w:id="0"/>
+      <w:r>
+        <w:t xml:space="preserve">1.5 mL Eppendorf tube </w:t>
+      </w:r>
+      <w:commentRangeEnd w:id="0"/>
+      <w:r>
+        <w:rPr>
+          <w:rStyle w:val="CommentReference"/>
+        </w:rPr>
+        <w:commentReference w:id="0"/>
+      </w:r>
+      <w:r>
+        <w:t xml:space="preserve">and shipped in dry ice to </w:t>
+      </w:r>
+      <w:proofErr w:type="spellStart"/>
+      <w:r>
+        <w:t>Prebiomics</w:t>
+      </w:r>
+      <w:proofErr w:type="spellEnd"/>
+      <w:r>
+        <w:t>, Trento, Italy for the rest of the remaining steps.</w:t>
+      </w:r>
+    </w:p>
+    <w:p>
+      <w:r>
+        <w:rPr>
+          <w:rStyle w:val="Heading2Char"/>
+        </w:rPr>
+        <w:t>DNA quality control and dilution</w:t>
+      </w:r>
+      <w:r>
+        <w:br/>
+        <w:t>The DNA coming from 403 fecal pellet samples and already isolated was quantified by using the Quant-</w:t>
+      </w:r>
+      <w:proofErr w:type="spellStart"/>
+      <w:r>
+        <w:t>iT</w:t>
+      </w:r>
+      <w:proofErr w:type="spellEnd"/>
+      <w:r>
+        <w:t xml:space="preserve">™ 1X dsDNA Assay Kits, BR (Life Technologies, #Q33267) in combination with the </w:t>
+      </w:r>
+      <w:proofErr w:type="spellStart"/>
+      <w:r>
+        <w:t>Varioskan</w:t>
+      </w:r>
+      <w:proofErr w:type="spellEnd"/>
+      <w:r>
+        <w:t xml:space="preserve"> LUX Microplate Reader (</w:t>
+      </w:r>
+      <w:proofErr w:type="spellStart"/>
+      <w:r>
+        <w:t>Thermo</w:t>
+      </w:r>
+      <w:proofErr w:type="spellEnd"/>
+      <w:r>
+        <w:t xml:space="preserve"> Fisher Scientific, #VL0000D0). The DNA was then diluted in water for library </w:t>
+      </w:r>
+      <w:proofErr w:type="spellStart"/>
+      <w:r>
+        <w:t>preparation.</w:t>
+      </w:r>
+    </w:p>
+    <w:p>
+      <w:proofErr w:type="spellEnd"/>
+      <w:r>
+        <w:rPr>
+          <w:rStyle w:val="Heading2Char"/>
+        </w:rPr>
+        <w:t>Library preparation and sequencing</w:t>
+      </w:r>
+      <w:r>
+        <w:rPr>
+          <w:rStyle w:val="Heading2Char"/>
+        </w:rPr>
+        <w:br/>
+      </w:r>
+      <w:r>
+        <w:t xml:space="preserve">The sequencing libraries were prepared with the Illumina DNA Prep, (M) </w:t>
+      </w:r>
+      <w:proofErr w:type="spellStart"/>
+      <w:r>
+        <w:t>Tagmentation</w:t>
+      </w:r>
+      <w:proofErr w:type="spellEnd"/>
+      <w:r>
+        <w:t xml:space="preserve"> (96 Samples, IPB) kit (Illumina, #20060059) in combination with the UD for Illumina DNA/RNA UD Indexes and the amplified libraries were purified with the double-sided bead purification procedure, as described by the Illumina protocol. Then, libraries concentration (ng/µ</w:t>
+      </w:r>
+      <w:r>
+        <w:t>L</w:t>
+      </w:r>
+      <w:r>
+        <w:t>) were quantified with the Quant-</w:t>
+      </w:r>
+      <w:proofErr w:type="spellStart"/>
+      <w:r>
+        <w:t>iT</w:t>
+      </w:r>
+      <w:proofErr w:type="spellEnd"/>
+      <w:r>
+        <w:t xml:space="preserve">™ 1X dsDNA Assay Kits, HS (Life Technologies, #Q33232) in combination with the </w:t>
+      </w:r>
+      <w:proofErr w:type="spellStart"/>
+      <w:r>
+        <w:t>Varioskan</w:t>
+      </w:r>
+      <w:proofErr w:type="spellEnd"/>
+      <w:r>
+        <w:t xml:space="preserve"> LUX Microplate Reader (</w:t>
+      </w:r>
+      <w:proofErr w:type="spellStart"/>
+      <w:r>
+        <w:t>Thermo</w:t>
+      </w:r>
+      <w:proofErr w:type="spellEnd"/>
+      <w:r>
+        <w:t xml:space="preserve"> Fisher Scientific, #VL0000D0). In addition, the base pair length (bp) was evaluated by using the D5000 </w:t>
+      </w:r>
+      <w:proofErr w:type="spellStart"/>
+      <w:r>
+        <w:t>ScreenTape</w:t>
+      </w:r>
+      <w:proofErr w:type="spellEnd"/>
+      <w:r>
+        <w:t xml:space="preserve"> Assay (Agilent, #5067-5588/9) in combination with the </w:t>
+      </w:r>
+      <w:proofErr w:type="spellStart"/>
+      <w:r>
+        <w:t>TapeStation</w:t>
+      </w:r>
+      <w:proofErr w:type="spellEnd"/>
+      <w:r>
+        <w:t xml:space="preserve"> 4150 (Agilent Technologies, #G2992AA). By knowing both library concentration and </w:t>
+      </w:r>
+      <w:r>
+        <w:t>bp</w:t>
+      </w:r>
+      <w:r>
+        <w:t xml:space="preserve"> length, it is possible to obtain the correct library volume to pool in the same tube to achieve optimal cluster density</w:t>
+      </w:r>
+      <w:r>
+        <w:t xml:space="preserve"> during sequencing</w:t>
+      </w:r>
+      <w:r>
+        <w:t xml:space="preserve">. The library pool was then quantified with the Qubit 1x dsDNA HS kit (Life Technologies, #Q33231) </w:t>
+      </w:r>
+      <w:r>
+        <w:t xml:space="preserve">and a </w:t>
+      </w:r>
+      <w:r>
+        <w:t>Qubit® 3.0 Fluorometer (Life Technologies, #Q33216)</w:t>
+      </w:r>
+      <w:r>
+        <w:t>. T</w:t>
+      </w:r>
+      <w:r>
+        <w:t xml:space="preserve">he base pair length (bp) was evaluated as described before. Finally, the library pools were sequenced using the </w:t>
+      </w:r>
+      <w:proofErr w:type="spellStart"/>
+      <w:r>
+        <w:t>Novaseq</w:t>
+      </w:r>
+      <w:proofErr w:type="spellEnd"/>
+      <w:r>
+        <w:t xml:space="preserve"> X Plus platform (Illumina) at an average depth of 15 </w:t>
+      </w:r>
+      <w:r>
+        <w:t xml:space="preserve">billion </w:t>
+      </w:r>
+      <w:r>
+        <w:t>b</w:t>
+      </w:r>
+      <w:r>
+        <w:t>p</w:t>
+      </w:r>
+      <w:r>
+        <w:t xml:space="preserve"> per sample.</w:t>
       </w:r>
     </w:p>
     <w:p>
@@ -53,48 +276,21 @@
         <w:pStyle w:val="Heading2"/>
       </w:pPr>
       <w:r>
-        <w:t xml:space="preserve">DNA pooling and sequencing </w:t>
-      </w:r>
+        <w:t>FASTQ</w:t>
+      </w:r>
+      <w:r>
+        <w:t xml:space="preserve"> processing </w:t>
+      </w:r>
+      <w:proofErr w:type="spellStart"/>
+      <w:r>
+        <w:t>pipeling</w:t>
+      </w:r>
+      <w:proofErr w:type="spellEnd"/>
     </w:p>
     <w:p>
       <w:r>
-        <w:t xml:space="preserve">Library preparation and Sequencing was performed by </w:t>
-      </w:r>
-      <w:proofErr w:type="spellStart"/>
-      <w:r>
-        <w:t>Prebiomics</w:t>
-      </w:r>
-      <w:proofErr w:type="spellEnd"/>
-      <w:r>
-        <w:t>.</w:t>
-      </w:r>
-      <w:r>
-        <w:t xml:space="preserve"> In brief, DNA l</w:t>
-      </w:r>
-      <w:r>
-        <w:t xml:space="preserve">ibraries were prepared using the Illumina DNA Prep, (M) </w:t>
-      </w:r>
-      <w:proofErr w:type="spellStart"/>
-      <w:r>
-        <w:t>Tagmentation</w:t>
-      </w:r>
-      <w:proofErr w:type="spellEnd"/>
-      <w:r>
-        <w:t xml:space="preserve"> (96 Samples, IPB) kit (Illumina, #20060059). Sequencing was performed using Illumina </w:t>
-      </w:r>
-      <w:proofErr w:type="spellStart"/>
-      <w:r>
-        <w:t>NovaSeq</w:t>
-      </w:r>
-      <w:proofErr w:type="spellEnd"/>
-      <w:r>
-        <w:t xml:space="preserve"> X Plus aiming for 70 million reads per sample, with mean read length of 150 base pairs. </w:t>
-      </w:r>
-      <w:proofErr w:type="spellStart"/>
-      <w:r>
-        <w:t>Fastq</w:t>
-      </w:r>
-      <w:proofErr w:type="spellEnd"/>
+        <w:t>FASTQ</w:t>
+      </w:r>
       <w:r>
         <w:t xml:space="preserve"> files were uniformly processed using the </w:t>
       </w:r>
@@ -106,24 +302,12 @@
       <w:r>
         <w:t xml:space="preserve"> pipeline (</w:t>
       </w:r>
-      <w:hyperlink r:id="rId4" w:tgtFrame="_blank" w:history="1">
+      <w:hyperlink r:id="rId8" w:tgtFrame="_blank" w:history="1">
         <w:r>
           <w:rPr>
             <w:rStyle w:val="Hyperlink"/>
           </w:rPr>
-          <w:t>https://github.com/seandavi/curatedMetagenom</w:t>
-        </w:r>
-        <w:r>
-          <w:rPr>
-            <w:rStyle w:val="Hyperlink"/>
-          </w:rPr>
-          <w:t>i</w:t>
-        </w:r>
-        <w:r>
-          <w:rPr>
-            <w:rStyle w:val="Hyperlink"/>
-          </w:rPr>
-          <w:t>csNextflow</w:t>
+          <w:t>https://github.com/seandavi/curatedMetagenomicsNextflow</w:t>
         </w:r>
       </w:hyperlink>
       <w:r>
@@ -138,7 +322,36 @@
         <w:t>.</w:t>
       </w:r>
       <w:r>
-        <w:t xml:space="preserve"> The pipeline is designed to run </w:t>
+        <w:t xml:space="preserve"> </w:t>
+      </w:r>
+      <w:r>
+        <w:t xml:space="preserve">The core output of the pipeline </w:t>
+      </w:r>
+      <w:r>
+        <w:t xml:space="preserve">includes Quality control </w:t>
+      </w:r>
+      <w:r>
+        <w:lastRenderedPageBreak/>
+        <w:t>(</w:t>
+      </w:r>
+      <w:proofErr w:type="spellStart"/>
+      <w:r>
+        <w:t>FastQC</w:t>
+      </w:r>
+      <w:proofErr w:type="spellEnd"/>
+      <w:r>
+        <w:t xml:space="preserve"> and </w:t>
+      </w:r>
+      <w:proofErr w:type="spellStart"/>
+      <w:r>
+        <w:t>Trimmomatic</w:t>
+      </w:r>
+      <w:proofErr w:type="spellEnd"/>
+      <w:r>
+        <w:t>), followed by</w:t>
+      </w:r>
+      <w:r>
+        <w:t xml:space="preserve"> </w:t>
       </w:r>
       <w:proofErr w:type="spellStart"/>
       <w:r>
@@ -146,9 +359,15 @@
       </w:r>
       <w:proofErr w:type="spellEnd"/>
       <w:r>
-        <w:t xml:space="preserve"> 4.1.1(</w:t>
-      </w:r>
-      <w:hyperlink r:id="rId5" w:history="1">
+        <w:t xml:space="preserve"> 4.1.1</w:t>
+      </w:r>
+      <w:r>
+        <w:t xml:space="preserve"> </w:t>
+      </w:r>
+      <w:r>
+        <w:t>(</w:t>
+      </w:r>
+      <w:hyperlink r:id="rId9" w:history="1">
         <w:r>
           <w:rPr>
             <w:rStyle w:val="Hyperlink"/>
@@ -157,26 +376,48 @@
         </w:r>
       </w:hyperlink>
       <w:r>
-        <w:t xml:space="preserve">) and </w:t>
-      </w:r>
-      <w:proofErr w:type="spellStart"/>
-      <w:r>
+        <w:t xml:space="preserve">) </w:t>
+      </w:r>
+      <w:r>
+        <w:rPr>
+          <w:color w:val="ADADAD" w:themeColor="background2" w:themeShade="BF"/>
+        </w:rPr>
+        <w:t xml:space="preserve">and </w:t>
+      </w:r>
+      <w:proofErr w:type="spellStart"/>
+      <w:r>
+        <w:rPr>
+          <w:color w:val="ADADAD" w:themeColor="background2" w:themeShade="BF"/>
+        </w:rPr>
         <w:t>HUMANnN</w:t>
       </w:r>
       <w:proofErr w:type="spellEnd"/>
       <w:r>
+        <w:rPr>
+          <w:color w:val="ADADAD" w:themeColor="background2" w:themeShade="BF"/>
+        </w:rPr>
         <w:t xml:space="preserve"> 3.9 (</w:t>
       </w:r>
-      <w:hyperlink r:id="rId6" w:history="1">
+      <w:hyperlink r:id="rId10" w:history="1">
         <w:r>
           <w:rPr>
             <w:rStyle w:val="Hyperlink"/>
+            <w:color w:val="ADADAD" w:themeColor="background2" w:themeShade="BF"/>
           </w:rPr>
           <w:t>https://doi.org/10.7554/eLife.65088</w:t>
         </w:r>
       </w:hyperlink>
       <w:r>
-        <w:t>) in a uniform and versioned pipeline.</w:t>
+        <w:rPr>
+          <w:color w:val="ADADAD" w:themeColor="background2" w:themeShade="BF"/>
+        </w:rPr>
+        <w:t>)</w:t>
+      </w:r>
+      <w:r>
+        <w:t xml:space="preserve"> abundance profiles, which were used for statistical analyses</w:t>
+      </w:r>
+      <w:r>
+        <w:t>.</w:t>
       </w:r>
     </w:p>
     <w:p>
@@ -189,7 +430,13 @@
     </w:p>
     <w:p>
       <w:r>
-        <w:t xml:space="preserve">All analyses were performed in R 4.5.1 using R-Studio 2025.05.0 (build 496). </w:t>
+        <w:t>All analyses were performed in R 4.5.</w:t>
+      </w:r>
+      <w:r>
+        <w:t>0</w:t>
+      </w:r>
+      <w:r>
+        <w:t xml:space="preserve"> using R-Studio 2025.05.0 (build 496). </w:t>
       </w:r>
     </w:p>
     <w:p>
@@ -212,7 +459,7 @@
       <w:r>
         <w:t xml:space="preserve">”, available at </w:t>
       </w:r>
-      <w:hyperlink r:id="rId7" w:history="1">
+      <w:hyperlink r:id="rId11" w:history="1">
         <w:r>
           <w:rPr>
             <w:rStyle w:val="Hyperlink"/>
@@ -221,7 +468,10 @@
         </w:r>
       </w:hyperlink>
       <w:r>
-        <w:t xml:space="preserve">. The vignette illustrates and example usage. This creates a </w:t>
+        <w:t xml:space="preserve">, which </w:t>
+      </w:r>
+      <w:r>
+        <w:t xml:space="preserve">creates a </w:t>
       </w:r>
       <w:proofErr w:type="spellStart"/>
       <w:r>
@@ -229,7 +479,13 @@
       </w:r>
       <w:proofErr w:type="spellEnd"/>
       <w:r>
-        <w:t xml:space="preserve"> object, which we converted into a </w:t>
+        <w:t xml:space="preserve"> object</w:t>
+      </w:r>
+      <w:r>
+        <w:t xml:space="preserve"> that can be con</w:t>
+      </w:r>
+      <w:r>
+        <w:t xml:space="preserve">verted into a </w:t>
       </w:r>
       <w:proofErr w:type="spellStart"/>
       <w:r>
@@ -237,7 +493,13 @@
       </w:r>
       <w:proofErr w:type="spellEnd"/>
       <w:r>
-        <w:t xml:space="preserve"> object to ensure compatibility for the “</w:t>
+        <w:t xml:space="preserve"> to </w:t>
+      </w:r>
+      <w:r>
+        <w:t xml:space="preserve">allow analyses with </w:t>
+      </w:r>
+      <w:r>
+        <w:t>“</w:t>
       </w:r>
       <w:proofErr w:type="spellStart"/>
       <w:r>
@@ -277,13 +539,13 @@
         <w:t xml:space="preserve"> We analyzed samples </w:t>
       </w:r>
       <w:r>
-        <w:t xml:space="preserve">at species genome bin </w:t>
-      </w:r>
-      <w:r>
-        <w:t>(SGB)</w:t>
-      </w:r>
-      <w:r>
-        <w:t xml:space="preserve"> level with one exception in the relative abundance </w:t>
+        <w:t>at species genome bin (SGB) level with one exception</w:t>
+      </w:r>
+      <w:r>
+        <w:t>:</w:t>
+      </w:r>
+      <w:r>
+        <w:t xml:space="preserve"> the relative abundance </w:t>
       </w:r>
       <w:proofErr w:type="spellStart"/>
       <w:r>
@@ -291,16 +553,25 @@
       </w:r>
       <w:proofErr w:type="spellEnd"/>
       <w:r>
-        <w:t xml:space="preserve"> shown in panel A of Figures </w:t>
+        <w:t xml:space="preserve"> shown in panel A of </w:t>
       </w:r>
       <w:r>
         <w:rPr>
           <w:highlight w:val="yellow"/>
         </w:rPr>
+        <w:t>Figures</w:t>
+      </w:r>
+      <w:r>
+        <w:t xml:space="preserve"> </w:t>
+      </w:r>
+      <w:r>
+        <w:rPr>
+          <w:highlight w:val="yellow"/>
+        </w:rPr>
         <w:t>N and N + 1</w:t>
       </w:r>
       <w:r>
-        <w:t>, where we aggregated microbiome data were aggregated at Phylum level to aid readability.</w:t>
+        <w:t xml:space="preserve"> where we aggregated microbiome data were aggregated at Phylum level to aid readability.</w:t>
       </w:r>
     </w:p>
     <w:p>
@@ -330,31 +601,13 @@
         <w:t xml:space="preserve"> alpha and beta diversity </w:t>
       </w:r>
       <w:r>
-        <w:t xml:space="preserve">our analyses. Richness and Shannon diversity were calculated with </w:t>
-      </w:r>
-      <w:proofErr w:type="spellStart"/>
-      <w:r>
-        <w:t>addAlpha</w:t>
-      </w:r>
-      <w:proofErr w:type="spellEnd"/>
-      <w:r>
-        <w:t>, without rarefaction</w:t>
-      </w:r>
-      <w:r>
-        <w:t xml:space="preserve">. </w:t>
-      </w:r>
-      <w:r>
-        <w:t>To test for genotype-treatment differences in alpha diversity, we applied pairwise Mann-</w:t>
-      </w:r>
-      <w:r>
-        <w:lastRenderedPageBreak/>
-        <w:t>Whitney U test implemented in the “stats”</w:t>
-      </w:r>
-      <w:r>
-        <w:t xml:space="preserve"> </w:t>
-      </w:r>
-      <w:r>
-        <w:t xml:space="preserve">package and wrapped in “ggplot2” </w:t>
+        <w:t xml:space="preserve">analyses. </w:t>
+      </w:r>
+      <w:r>
+        <w:t>Observed r</w:t>
+      </w:r>
+      <w:r>
+        <w:t xml:space="preserve">ichness and Shannon diversity were calculated with </w:t>
       </w:r>
       <w:proofErr w:type="spellStart"/>
       <w:r>
@@ -362,6 +615,27 @@
           <w:i/>
           <w:iCs/>
         </w:rPr>
+        <w:t>addAlpha</w:t>
+      </w:r>
+      <w:proofErr w:type="spellEnd"/>
+      <w:r>
+        <w:t xml:space="preserve">. </w:t>
+      </w:r>
+      <w:r>
+        <w:t>To test for genotype-treatment differences in alpha diversity, we applied pairwise Mann-Whitney U test implemented in the “stats”</w:t>
+      </w:r>
+      <w:r>
+        <w:t xml:space="preserve"> </w:t>
+      </w:r>
+      <w:r>
+        <w:t xml:space="preserve">package and wrapped in “ggplot2” </w:t>
+      </w:r>
+      <w:proofErr w:type="spellStart"/>
+      <w:r>
+        <w:rPr>
+          <w:i/>
+          <w:iCs/>
+        </w:rPr>
         <w:t>stat_compare_means</w:t>
       </w:r>
       <w:proofErr w:type="spellEnd"/>
@@ -369,7 +643,16 @@
         <w:t xml:space="preserve"> </w:t>
       </w:r>
       <w:r>
-        <w:t>to show unadjusted p-values in the plots</w:t>
+        <w:t xml:space="preserve">and reported </w:t>
+      </w:r>
+      <w:r>
+        <w:t xml:space="preserve">unadjusted p-values in the </w:t>
+      </w:r>
+      <w:r>
+        <w:t xml:space="preserve">relative </w:t>
+      </w:r>
+      <w:r>
+        <w:t>plots</w:t>
       </w:r>
       <w:r>
         <w:t xml:space="preserve">. </w:t>
@@ -451,7 +734,13 @@
       </w:r>
       <w:proofErr w:type="spellEnd"/>
       <w:r>
-        <w:t xml:space="preserve">. To further test for non-uniformity between groups, we performed a pairwise PERMANOVA with </w:t>
+        <w:t>. To further test for non-</w:t>
+      </w:r>
+      <w:r>
+        <w:t xml:space="preserve">overlap </w:t>
+      </w:r>
+      <w:r>
+        <w:t xml:space="preserve">between groups, we performed a pairwise PERMANOVA with </w:t>
       </w:r>
       <w:proofErr w:type="spellStart"/>
       <w:r>
@@ -465,7 +754,7 @@
       <w:r>
         <w:t xml:space="preserve">, a custom function documented in </w:t>
       </w:r>
-      <w:hyperlink r:id="rId8" w:history="1">
+      <w:hyperlink r:id="rId12" w:history="1">
         <w:r>
           <w:rPr>
             <w:rStyle w:val="Hyperlink"/>
@@ -490,52 +779,165 @@
     </w:p>
     <w:p>
       <w:r>
-        <w:t xml:space="preserve">We tested whether probiotic treatment would be associated with differences in relative abundance or prevalence of specific species genome bins (SGBs). </w:t>
-      </w:r>
-    </w:p>
-    <w:p>
-      <w:pPr>
-        <w:pStyle w:val="Heading3"/>
-      </w:pPr>
-      <w:r>
-        <w:t xml:space="preserve">Resulting reads were gathered using the </w:t>
-      </w:r>
-      <w:proofErr w:type="spellStart"/>
-      <w:r>
-        <w:t>parkinsonsMetagenomicData</w:t>
-      </w:r>
-      <w:proofErr w:type="spellEnd"/>
-      <w:r>
-        <w:t xml:space="preserve"> R </w:t>
-      </w:r>
-      <w:proofErr w:type="gramStart"/>
-      <w:r>
-        <w:t>package .</w:t>
-      </w:r>
-      <w:proofErr w:type="gramEnd"/>
+        <w:t>We tested whether probiotic treatment would be associated with differences in relative abundance or prevalence of specific species genome bins (SGBs)</w:t>
+      </w:r>
+      <w:r>
+        <w:t xml:space="preserve"> using MaAsLin3 (</w:t>
+      </w:r>
+      <w:hyperlink r:id="rId13" w:history="1">
+        <w:r>
+          <w:rPr>
+            <w:rStyle w:val="Hyperlink"/>
+          </w:rPr>
+          <w:t>https://www.biorxiv.org/content/10.1101/2024.12.13.628459v1</w:t>
+        </w:r>
+      </w:hyperlink>
+      <w:r>
+        <w:t xml:space="preserve">). We applied a log2 </w:t>
+      </w:r>
+      <w:r>
+        <w:lastRenderedPageBreak/>
+        <w:t xml:space="preserve">transformation to the </w:t>
+      </w:r>
+      <w:r>
+        <w:t xml:space="preserve">SGBs with </w:t>
+      </w:r>
+      <w:r>
+        <w:t xml:space="preserve">relative abundance </w:t>
+      </w:r>
+      <w:r>
+        <w:t xml:space="preserve">scaled between </w:t>
+      </w:r>
+      <w:r>
+        <w:t xml:space="preserve">0 </w:t>
+      </w:r>
+      <w:r>
+        <w:t>and</w:t>
+      </w:r>
+      <w:r>
+        <w:t xml:space="preserve"> 1. We tested for treatment effect (either </w:t>
+      </w:r>
+      <w:proofErr w:type="spellStart"/>
+      <w:r>
+        <w:t>Fp</w:t>
+      </w:r>
+      <w:proofErr w:type="spellEnd"/>
+      <w:r>
+        <w:t xml:space="preserve"> or </w:t>
+      </w:r>
+      <w:proofErr w:type="spellStart"/>
+      <w:r>
+        <w:t>benCom</w:t>
+      </w:r>
+      <w:proofErr w:type="spellEnd"/>
+      <w:r>
+        <w:t>) in ASO mice treated with sterile saline solution. We adjusted resulting p-values for false discovery rate using the Benjamini-Hochberg method</w:t>
+      </w:r>
+      <w:r>
+        <w:t xml:space="preserve"> as implemented in MaAsLin3</w:t>
+      </w:r>
+      <w:r>
+        <w:t xml:space="preserve">. We reported </w:t>
+      </w:r>
+      <w:r>
+        <w:t xml:space="preserve">the </w:t>
+      </w:r>
+      <w:r>
+        <w:t xml:space="preserve">summary </w:t>
+      </w:r>
+      <w:r>
+        <w:t>figure generated by the package</w:t>
+      </w:r>
+      <w:r>
+        <w:t xml:space="preserve"> without alterations</w:t>
+      </w:r>
+      <w:r>
+        <w:t>.</w:t>
+      </w:r>
     </w:p>
     <w:p>
       <w:pPr>
         <w:pStyle w:val="Heading1"/>
       </w:pPr>
       <w:r>
-        <w:t xml:space="preserve"> </w:t>
-      </w:r>
-      <w:r>
-        <w:t>Data availability</w:t>
+        <w:t xml:space="preserve">Data </w:t>
+      </w:r>
+      <w:r>
+        <w:t xml:space="preserve">and code </w:t>
+      </w:r>
+      <w:r>
+        <w:t>availability</w:t>
       </w:r>
     </w:p>
     <w:p>
       <w:r>
         <w:t xml:space="preserve">Raw </w:t>
       </w:r>
-      <w:proofErr w:type="spellStart"/>
-      <w:r>
-        <w:t>FastQ</w:t>
-      </w:r>
-      <w:proofErr w:type="spellEnd"/>
-      <w:r>
-        <w:t xml:space="preserve"> reads were deposited in </w:t>
+      <w:r>
+        <w:t xml:space="preserve">FASTQ files </w:t>
+      </w:r>
+      <w:r>
+        <w:t xml:space="preserve">were deposited </w:t>
+      </w:r>
+      <w:r>
+        <w:t xml:space="preserve">on SRA with </w:t>
+      </w:r>
+      <w:commentRangeStart w:id="1"/>
+      <w:r>
+        <w:rPr>
+          <w:highlight w:val="yellow"/>
+        </w:rPr>
+        <w:t>code …</w:t>
+      </w:r>
+      <w:commentRangeEnd w:id="1"/>
+      <w:r>
+        <w:rPr>
+          <w:rStyle w:val="CommentReference"/>
+        </w:rPr>
+        <w:commentReference w:id="1"/>
+      </w:r>
+      <w:r>
+        <w:t xml:space="preserve"> Along with sample metadata. Merged data tables were generated in R and made available </w:t>
+      </w:r>
+      <w:commentRangeStart w:id="2"/>
+      <w:r>
+        <w:rPr>
+          <w:highlight w:val="yellow"/>
+        </w:rPr>
+        <w:t>via …</w:t>
+      </w:r>
+      <w:commentRangeEnd w:id="2"/>
+      <w:r>
+        <w:rPr>
+          <w:rStyle w:val="CommentReference"/>
+        </w:rPr>
+        <w:commentReference w:id="2"/>
+      </w:r>
+      <w:r>
+        <w:t xml:space="preserve">. The code to generate microbiome data, figures, and statistics </w:t>
+      </w:r>
+      <w:r>
+        <w:t>is</w:t>
+      </w:r>
+      <w:r>
+        <w:t xml:space="preserve"> available at </w:t>
+      </w:r>
+      <w:hyperlink r:id="rId14" w:history="1">
+        <w:r>
+          <w:rPr>
+            <w:rStyle w:val="Hyperlink"/>
+          </w:rPr>
+          <w:t>https://github.com/ASAP-MAC/MazmanianS_MoiseyenkoA</w:t>
+        </w:r>
+      </w:hyperlink>
+      <w:r>
+        <w:t>.</w:t>
+      </w:r>
+      <w:r>
+        <w:t xml:space="preserve"> </w:t>
+      </w:r>
+      <w:r>
+        <w:t xml:space="preserve"> </w:t>
       </w:r>
     </w:p>
     <w:sectPr>
@@ -546,6 +948,94 @@
     </w:sectPr>
   </w:body>
 </w:document>
+</file>
+
+<file path=word/comments.xml><?xml version="1.0" encoding="utf-8"?>
+<w:comments xmlns:wpc="http://schemas.microsoft.com/office/word/2010/wordprocessingCanvas" xmlns:cx="http://schemas.microsoft.com/office/drawing/2014/chartex" xmlns:cx1="http://schemas.microsoft.com/office/drawing/2015/9/8/chartex" xmlns:cx2="http://schemas.microsoft.com/office/drawing/2015/10/21/chartex" xmlns:cx3="http://schemas.microsoft.com/office/drawing/2016/5/9/chartex" xmlns:cx4="http://schemas.microsoft.com/office/drawing/2016/5/10/chartex" xmlns:cx5="http://schemas.microsoft.com/office/drawing/2016/5/11/chartex" xmlns:cx6="http://schemas.microsoft.com/office/drawing/2016/5/12/chartex" xmlns:cx7="http://schemas.microsoft.com/office/drawing/2016/5/13/chartex" xmlns:cx8="http://schemas.microsoft.com/office/drawing/2016/5/14/chartex" xmlns:mc="http://schemas.openxmlformats.org/markup-compatibility/2006" xmlns:aink="http://schemas.microsoft.com/office/drawing/2016/ink" xmlns:am3d="http://schemas.microsoft.com/office/drawing/2017/model3d" xmlns:o="urn:schemas-microsoft-com:office:office" xmlns:oel="http://schemas.microsoft.com/office/2019/extlst" xmlns:r="http://schemas.openxmlformats.org/officeDocument/2006/relationships" xmlns:m="http://schemas.openxmlformats.org/officeDocument/2006/math" xmlns:v="urn:schemas-microsoft-com:vml" xmlns:wp14="http://schemas.microsoft.com/office/word/2010/wordprocessingDrawing" xmlns:wp="http://schemas.openxmlformats.org/drawingml/2006/wordprocessingDrawing" xmlns:w10="urn:schemas-microsoft-com:office:word" xmlns:w="http://schemas.openxmlformats.org/wordprocessingml/2006/main" xmlns:w14="http://schemas.microsoft.com/office/word/2010/wordml" xmlns:w15="http://schemas.microsoft.com/office/word/2012/wordml" xmlns:w16cex="http://schemas.microsoft.com/office/word/2018/wordml/cex" xmlns:w16cid="http://schemas.microsoft.com/office/word/2016/wordml/cid" xmlns:w16="http://schemas.microsoft.com/office/word/2018/wordml" xmlns:w16du="http://schemas.microsoft.com/office/word/2023/wordml/word16du" xmlns:w16sdtdh="http://schemas.microsoft.com/office/word/2020/wordml/sdtdatahash" xmlns:w16sdtfl="http://schemas.microsoft.com/office/word/2024/wordml/sdtformatlock" xmlns:w16se="http://schemas.microsoft.com/office/word/2015/wordml/symex" xmlns:wpg="http://schemas.microsoft.com/office/word/2010/wordprocessingGroup" xmlns:wpi="http://schemas.microsoft.com/office/word/2010/wordprocessingInk" xmlns:wne="http://schemas.microsoft.com/office/word/2006/wordml" xmlns:wps="http://schemas.microsoft.com/office/word/2010/wordprocessingShape" mc:Ignorable="w14 w15 w16se w16cid w16 w16cex w16sdtdh w16sdtfl w16du wp14">
+  <w:comment w:id="0" w:author="Giacomo Antonello" w:date="2025-07-15T11:04:00Z" w:initials="GA">
+    <w:p>
+      <w:r>
+        <w:rPr>
+          <w:rStyle w:val="CommentReference"/>
+        </w:rPr>
+        <w:annotationRef/>
+      </w:r>
+      <w:r>
+        <w:rPr>
+          <w:sz w:val="20"/>
+          <w:szCs w:val="20"/>
+        </w:rPr>
+        <w:t>something special? maybe with some with a tighter lock?</w:t>
+      </w:r>
+    </w:p>
+  </w:comment>
+  <w:comment w:id="1" w:author="Giacomo Antonello" w:date="2025-07-15T11:02:00Z" w:initials="GA">
+    <w:p>
+      <w:r>
+        <w:rPr>
+          <w:rStyle w:val="CommentReference"/>
+        </w:rPr>
+        <w:annotationRef/>
+      </w:r>
+      <w:r>
+        <w:rPr>
+          <w:sz w:val="20"/>
+          <w:szCs w:val="20"/>
+        </w:rPr>
+        <w:t>this will be available after we we remove the embargo on the SRA entry.</w:t>
+      </w:r>
+    </w:p>
+  </w:comment>
+  <w:comment w:id="2" w:author="Giacomo Antonello" w:date="2025-07-15T10:18:00Z" w:initials="GA">
+    <w:p>
+      <w:r>
+        <w:rPr>
+          <w:rStyle w:val="CommentReference"/>
+        </w:rPr>
+        <w:annotationRef/>
+      </w:r>
+      <w:r>
+        <w:rPr>
+          <w:sz w:val="20"/>
+          <w:szCs w:val="20"/>
+        </w:rPr>
+        <w:t>We should discuss this. Maybe zenodo? Because downloading the data from where they are for now is tricky and requires a google cloud storage key/</w:t>
+      </w:r>
+    </w:p>
+  </w:comment>
+</w:comments>
+</file>
+
+<file path=word/commentsExtended.xml><?xml version="1.0" encoding="utf-8"?>
+<w15:commentsEx xmlns:wpc="http://schemas.microsoft.com/office/word/2010/wordprocessingCanvas" xmlns:cx="http://schemas.microsoft.com/office/drawing/2014/chartex" xmlns:cx1="http://schemas.microsoft.com/office/drawing/2015/9/8/chartex" xmlns:cx2="http://schemas.microsoft.com/office/drawing/2015/10/21/chartex" xmlns:cx3="http://schemas.microsoft.com/office/drawing/2016/5/9/chartex" xmlns:cx4="http://schemas.microsoft.com/office/drawing/2016/5/10/chartex" xmlns:cx5="http://schemas.microsoft.com/office/drawing/2016/5/11/chartex" xmlns:cx6="http://schemas.microsoft.com/office/drawing/2016/5/12/chartex" xmlns:cx7="http://schemas.microsoft.com/office/drawing/2016/5/13/chartex" xmlns:cx8="http://schemas.microsoft.com/office/drawing/2016/5/14/chartex" xmlns:mc="http://schemas.openxmlformats.org/markup-compatibility/2006" xmlns:aink="http://schemas.microsoft.com/office/drawing/2016/ink" xmlns:am3d="http://schemas.microsoft.com/office/drawing/2017/model3d" xmlns:o="urn:schemas-microsoft-com:office:office" xmlns:oel="http://schemas.microsoft.com/office/2019/extlst" xmlns:r="http://schemas.openxmlformats.org/officeDocument/2006/relationships" xmlns:m="http://schemas.openxmlformats.org/officeDocument/2006/math" xmlns:v="urn:schemas-microsoft-com:vml" xmlns:wp14="http://schemas.microsoft.com/office/word/2010/wordprocessingDrawing" xmlns:wp="http://schemas.openxmlformats.org/drawingml/2006/wordprocessingDrawing" xmlns:w10="urn:schemas-microsoft-com:office:word" xmlns:w="http://schemas.openxmlformats.org/wordprocessingml/2006/main" xmlns:w14="http://schemas.microsoft.com/office/word/2010/wordml" xmlns:w15="http://schemas.microsoft.com/office/word/2012/wordml" xmlns:w16cex="http://schemas.microsoft.com/office/word/2018/wordml/cex" xmlns:w16cid="http://schemas.microsoft.com/office/word/2016/wordml/cid" xmlns:w16="http://schemas.microsoft.com/office/word/2018/wordml" xmlns:w16du="http://schemas.microsoft.com/office/word/2023/wordml/word16du" xmlns:w16sdtdh="http://schemas.microsoft.com/office/word/2020/wordml/sdtdatahash" xmlns:w16sdtfl="http://schemas.microsoft.com/office/word/2024/wordml/sdtformatlock" xmlns:w16se="http://schemas.microsoft.com/office/word/2015/wordml/symex" xmlns:wpg="http://schemas.microsoft.com/office/word/2010/wordprocessingGroup" xmlns:wpi="http://schemas.microsoft.com/office/word/2010/wordprocessingInk" xmlns:wne="http://schemas.microsoft.com/office/word/2006/wordml" xmlns:wps="http://schemas.microsoft.com/office/word/2010/wordprocessingShape" mc:Ignorable="w14 w15 w16se w16cid w16 w16cex w16sdtdh w16sdtfl w16du wp14">
+  <w15:commentEx w15:paraId="72A5C8B4" w15:done="0"/>
+  <w15:commentEx w15:paraId="4E9210BA" w15:done="0"/>
+  <w15:commentEx w15:paraId="09BC55A4" w15:done="0"/>
+</w15:commentsEx>
+</file>
+
+<file path=word/commentsExtensible.xml><?xml version="1.0" encoding="utf-8"?>
+<w16cex:commentsExtensible xmlns:wpc="http://schemas.microsoft.com/office/word/2010/wordprocessingCanvas" xmlns:cx="http://schemas.microsoft.com/office/drawing/2014/chartex" xmlns:cx1="http://schemas.microsoft.com/office/drawing/2015/9/8/chartex" xmlns:cx2="http://schemas.microsoft.com/office/drawing/2015/10/21/chartex" xmlns:cx3="http://schemas.microsoft.com/office/drawing/2016/5/9/chartex" xmlns:cx4="http://schemas.microsoft.com/office/drawing/2016/5/10/chartex" xmlns:cx5="http://schemas.microsoft.com/office/drawing/2016/5/11/chartex" xmlns:cx6="http://schemas.microsoft.com/office/drawing/2016/5/12/chartex" xmlns:cx7="http://schemas.microsoft.com/office/drawing/2016/5/13/chartex" xmlns:cx8="http://schemas.microsoft.com/office/drawing/2016/5/14/chartex" xmlns:cr="http://schemas.microsoft.com/office/comments/2020/reactions" xmlns:mc="http://schemas.openxmlformats.org/markup-compatibility/2006" xmlns:aink="http://schemas.microsoft.com/office/drawing/2016/ink" xmlns:am3d="http://schemas.microsoft.com/office/drawing/2017/model3d" xmlns:o="urn:schemas-microsoft-com:office:office" xmlns:oel="http://schemas.microsoft.com/office/2019/extlst" xmlns:r="http://schemas.openxmlformats.org/officeDocument/2006/relationships" xmlns:m="http://schemas.openxmlformats.org/officeDocument/2006/math" xmlns:v="urn:schemas-microsoft-com:vml" xmlns:wp14="http://schemas.microsoft.com/office/word/2010/wordprocessingDrawing" xmlns:wp="http://schemas.openxmlformats.org/drawingml/2006/wordprocessingDrawing" xmlns:w10="urn:schemas-microsoft-com:office:word" xmlns:w="http://schemas.openxmlformats.org/wordprocessingml/2006/main" xmlns:w14="http://schemas.microsoft.com/office/word/2010/wordml" xmlns:w15="http://schemas.microsoft.com/office/word/2012/wordml" xmlns:w16cex="http://schemas.microsoft.com/office/word/2018/wordml/cex" xmlns:w16cid="http://schemas.microsoft.com/office/word/2016/wordml/cid" xmlns:w16="http://schemas.microsoft.com/office/word/2018/wordml" xmlns:w16du="http://schemas.microsoft.com/office/word/2023/wordml/word16du" xmlns:w16sdtdh="http://schemas.microsoft.com/office/word/2020/wordml/sdtdatahash" xmlns:w16sdtfl="http://schemas.microsoft.com/office/word/2024/wordml/sdtformatlock" xmlns:w16se="http://schemas.microsoft.com/office/word/2015/wordml/symex" xmlns:wpg="http://schemas.microsoft.com/office/word/2010/wordprocessingGroup" xmlns:wpi="http://schemas.microsoft.com/office/word/2010/wordprocessingInk" xmlns:wne="http://schemas.microsoft.com/office/word/2006/wordml" xmlns:wps="http://schemas.microsoft.com/office/word/2010/wordprocessingShape" mc:Ignorable="w14 w15 w16se w16cid w16 w16cex w16sdtdh w16sdtfl cr w16du wp14">
+  <w16cex:commentExtensible w16cex:durableId="008BD773" w16cex:dateUtc="2025-07-15T15:04:00Z"/>
+  <w16cex:commentExtensible w16cex:durableId="11C3E614" w16cex:dateUtc="2025-07-15T15:02:00Z"/>
+  <w16cex:commentExtensible w16cex:durableId="45230323" w16cex:dateUtc="2025-07-15T14:18:00Z"/>
+</w16cex:commentsExtensible>
+</file>
+
+<file path=word/commentsIds.xml><?xml version="1.0" encoding="utf-8"?>
+<w16cid:commentsIds xmlns:wpc="http://schemas.microsoft.com/office/word/2010/wordprocessingCanvas" xmlns:cx="http://schemas.microsoft.com/office/drawing/2014/chartex" xmlns:cx1="http://schemas.microsoft.com/office/drawing/2015/9/8/chartex" xmlns:cx2="http://schemas.microsoft.com/office/drawing/2015/10/21/chartex" xmlns:cx3="http://schemas.microsoft.com/office/drawing/2016/5/9/chartex" xmlns:cx4="http://schemas.microsoft.com/office/drawing/2016/5/10/chartex" xmlns:cx5="http://schemas.microsoft.com/office/drawing/2016/5/11/chartex" xmlns:cx6="http://schemas.microsoft.com/office/drawing/2016/5/12/chartex" xmlns:cx7="http://schemas.microsoft.com/office/drawing/2016/5/13/chartex" xmlns:cx8="http://schemas.microsoft.com/office/drawing/2016/5/14/chartex" xmlns:mc="http://schemas.openxmlformats.org/markup-compatibility/2006" xmlns:aink="http://schemas.microsoft.com/office/drawing/2016/ink" xmlns:am3d="http://schemas.microsoft.com/office/drawing/2017/model3d" xmlns:o="urn:schemas-microsoft-com:office:office" xmlns:oel="http://schemas.microsoft.com/office/2019/extlst" xmlns:r="http://schemas.openxmlformats.org/officeDocument/2006/relationships" xmlns:m="http://schemas.openxmlformats.org/officeDocument/2006/math" xmlns:v="urn:schemas-microsoft-com:vml" xmlns:wp14="http://schemas.microsoft.com/office/word/2010/wordprocessingDrawing" xmlns:wp="http://schemas.openxmlformats.org/drawingml/2006/wordprocessingDrawing" xmlns:w10="urn:schemas-microsoft-com:office:word" xmlns:w="http://schemas.openxmlformats.org/wordprocessingml/2006/main" xmlns:w14="http://schemas.microsoft.com/office/word/2010/wordml" xmlns:w15="http://schemas.microsoft.com/office/word/2012/wordml" xmlns:w16cex="http://schemas.microsoft.com/office/word/2018/wordml/cex" xmlns:w16cid="http://schemas.microsoft.com/office/word/2016/wordml/cid" xmlns:w16="http://schemas.microsoft.com/office/word/2018/wordml" xmlns:w16du="http://schemas.microsoft.com/office/word/2023/wordml/word16du" xmlns:w16sdtdh="http://schemas.microsoft.com/office/word/2020/wordml/sdtdatahash" xmlns:w16sdtfl="http://schemas.microsoft.com/office/word/2024/wordml/sdtformatlock" xmlns:w16se="http://schemas.microsoft.com/office/word/2015/wordml/symex" xmlns:wpg="http://schemas.microsoft.com/office/word/2010/wordprocessingGroup" xmlns:wpi="http://schemas.microsoft.com/office/word/2010/wordprocessingInk" xmlns:wne="http://schemas.microsoft.com/office/word/2006/wordml" xmlns:wps="http://schemas.microsoft.com/office/word/2010/wordprocessingShape" mc:Ignorable="w14 w15 w16se w16cid w16 w16cex w16sdtdh w16sdtfl w16du wp14">
+  <w16cid:commentId w16cid:paraId="72A5C8B4" w16cid:durableId="008BD773"/>
+  <w16cid:commentId w16cid:paraId="4E9210BA" w16cid:durableId="11C3E614"/>
+  <w16cid:commentId w16cid:paraId="09BC55A4" w16cid:durableId="45230323"/>
+</w16cid:commentsIds>
+</file>
+
+<file path=word/people.xml><?xml version="1.0" encoding="utf-8"?>
+<w15:people xmlns:wpc="http://schemas.microsoft.com/office/word/2010/wordprocessingCanvas" xmlns:cx="http://schemas.microsoft.com/office/drawing/2014/chartex" xmlns:cx1="http://schemas.microsoft.com/office/drawing/2015/9/8/chartex" xmlns:cx2="http://schemas.microsoft.com/office/drawing/2015/10/21/chartex" xmlns:cx3="http://schemas.microsoft.com/office/drawing/2016/5/9/chartex" xmlns:cx4="http://schemas.microsoft.com/office/drawing/2016/5/10/chartex" xmlns:cx5="http://schemas.microsoft.com/office/drawing/2016/5/11/chartex" xmlns:cx6="http://schemas.microsoft.com/office/drawing/2016/5/12/chartex" xmlns:cx7="http://schemas.microsoft.com/office/drawing/2016/5/13/chartex" xmlns:cx8="http://schemas.microsoft.com/office/drawing/2016/5/14/chartex" xmlns:mc="http://schemas.openxmlformats.org/markup-compatibility/2006" xmlns:aink="http://schemas.microsoft.com/office/drawing/2016/ink" xmlns:am3d="http://schemas.microsoft.com/office/drawing/2017/model3d" xmlns:o="urn:schemas-microsoft-com:office:office" xmlns:oel="http://schemas.microsoft.com/office/2019/extlst" xmlns:r="http://schemas.openxmlformats.org/officeDocument/2006/relationships" xmlns:m="http://schemas.openxmlformats.org/officeDocument/2006/math" xmlns:v="urn:schemas-microsoft-com:vml" xmlns:wp14="http://schemas.microsoft.com/office/word/2010/wordprocessingDrawing" xmlns:wp="http://schemas.openxmlformats.org/drawingml/2006/wordprocessingDrawing" xmlns:w10="urn:schemas-microsoft-com:office:word" xmlns:w="http://schemas.openxmlformats.org/wordprocessingml/2006/main" xmlns:w14="http://schemas.microsoft.com/office/word/2010/wordml" xmlns:w15="http://schemas.microsoft.com/office/word/2012/wordml" xmlns:w16cex="http://schemas.microsoft.com/office/word/2018/wordml/cex" xmlns:w16cid="http://schemas.microsoft.com/office/word/2016/wordml/cid" xmlns:w16="http://schemas.microsoft.com/office/word/2018/wordml" xmlns:w16du="http://schemas.microsoft.com/office/word/2023/wordml/word16du" xmlns:w16sdtdh="http://schemas.microsoft.com/office/word/2020/wordml/sdtdatahash" xmlns:w16sdtfl="http://schemas.microsoft.com/office/word/2024/wordml/sdtformatlock" xmlns:w16se="http://schemas.microsoft.com/office/word/2015/wordml/symex" xmlns:wpg="http://schemas.microsoft.com/office/word/2010/wordprocessingGroup" xmlns:wpi="http://schemas.microsoft.com/office/word/2010/wordprocessingInk" xmlns:wne="http://schemas.microsoft.com/office/word/2006/wordml" xmlns:wps="http://schemas.microsoft.com/office/word/2010/wordprocessingShape" mc:Ignorable="w14 w15 w16se w16cid w16 w16cex w16sdtdh w16sdtfl w16du wp14">
+  <w15:person w15:author="Giacomo Antonello">
+    <w15:presenceInfo w15:providerId="AD" w15:userId="S::GIACOMO.ANTONELLO53@login.cuny.edu::2ce8390c-c822-41a3-a120-b6b579a517d0"/>
+  </w15:person>
+</w15:people>
 </file>
 
 <file path=word/styles.xml><?xml version="1.0" encoding="utf-8"?>
@@ -1495,6 +1985,74 @@
       <w:u w:val="single"/>
     </w:rPr>
   </w:style>
+  <w:style w:type="character" w:styleId="CommentReference">
+    <w:name w:val="annotation reference"/>
+    <w:basedOn w:val="DefaultParagraphFont"/>
+    <w:uiPriority w:val="99"/>
+    <w:semiHidden/>
+    <w:unhideWhenUsed/>
+    <w:rsid w:val="00337124"/>
+    <w:rPr>
+      <w:sz w:val="16"/>
+      <w:szCs w:val="16"/>
+    </w:rPr>
+  </w:style>
+  <w:style w:type="paragraph" w:styleId="CommentText">
+    <w:name w:val="annotation text"/>
+    <w:basedOn w:val="Normal"/>
+    <w:link w:val="CommentTextChar"/>
+    <w:uiPriority w:val="99"/>
+    <w:semiHidden/>
+    <w:unhideWhenUsed/>
+    <w:rsid w:val="00337124"/>
+    <w:pPr>
+      <w:spacing w:line="240" w:lineRule="auto"/>
+    </w:pPr>
+    <w:rPr>
+      <w:sz w:val="20"/>
+      <w:szCs w:val="20"/>
+    </w:rPr>
+  </w:style>
+  <w:style w:type="character" w:customStyle="1" w:styleId="CommentTextChar">
+    <w:name w:val="Comment Text Char"/>
+    <w:basedOn w:val="DefaultParagraphFont"/>
+    <w:link w:val="CommentText"/>
+    <w:uiPriority w:val="99"/>
+    <w:semiHidden/>
+    <w:rsid w:val="00337124"/>
+    <w:rPr>
+      <w:sz w:val="20"/>
+      <w:szCs w:val="20"/>
+    </w:rPr>
+  </w:style>
+  <w:style w:type="paragraph" w:styleId="CommentSubject">
+    <w:name w:val="annotation subject"/>
+    <w:basedOn w:val="CommentText"/>
+    <w:next w:val="CommentText"/>
+    <w:link w:val="CommentSubjectChar"/>
+    <w:uiPriority w:val="99"/>
+    <w:semiHidden/>
+    <w:unhideWhenUsed/>
+    <w:rsid w:val="00337124"/>
+    <w:rPr>
+      <w:b/>
+      <w:bCs/>
+    </w:rPr>
+  </w:style>
+  <w:style w:type="character" w:customStyle="1" w:styleId="CommentSubjectChar">
+    <w:name w:val="Comment Subject Char"/>
+    <w:basedOn w:val="CommentTextChar"/>
+    <w:link w:val="CommentSubject"/>
+    <w:uiPriority w:val="99"/>
+    <w:semiHidden/>
+    <w:rsid w:val="00337124"/>
+    <w:rPr>
+      <w:b/>
+      <w:bCs/>
+      <w:sz w:val="20"/>
+      <w:szCs w:val="20"/>
+    </w:rPr>
+  </w:style>
 </w:styles>
 </file>
 

</xml_diff>